<commit_message>
fix(master_driver): skip a batch step whose dependency failed
The orchestrator added a failed step to the same set that releases its
dependants, so a failed BPM analysis still started Tempo against files that
carried no BPM tag and the report counted it completed; sequential mode
consulted no graph at all. Terminal state and success are now separate sets,
one `_blocked_by` predicate serves both modes, and every step above the
failure in the chain is skipped with the reason on its line.

Audit R-10, plan C4.
</commit_message>
<xml_diff>
--- a/user_guides/individual_programs/master_driver/Master_Driver_User_Guide.docx
+++ b/user_guides/individual_programs/master_driver/Master_Driver_User_Guide.docx
@@ -665,7 +665,12 @@
     </w:p>
     <w:p>
       <w:r>
-        <w:t>A step that fails with a transient file-system error (a permission or input-output error) is retried twice: the driver waits two seconds, then four, before trying again. After the second retry the step is marked failed and the batch carries on with the next step, so one locked or unreadable file cannot abandon the rest of the run. A step that never completed shows as failed and carries no note, because there is no finished work to caveat. The one ordering the driver imposes is declared rather than learned: Tempo waits for BPM, and Mood waits for BPM, Key and Tempo when those tools are selected too.</w:t>
+        <w:t>A step that fails with a transient file-system error (a permission or input-output error) is retried twice: the driver waits two seconds, then four, before trying again. After the second retry the step is marked failed and the batch carries on with the next step, so one locked or unreadable file cannot abandon the rest of the run. A step that never completed shows as failed and carries no note, because there is no finished work to caveat. The one ordering the driver imposes is declared rather than learned: Tempo waits for BPM when both are selected.</w:t>
+      </w:r>
+    </w:p>
+    <w:p>
+      <w:r>
+        <w:t>A step whose required step did not succeed is skipped rather than started, in both sequential and Parallel mode. Its line gives the reason: skipped: dependency 'bpm' failed when BPM ran and failed, or did not run when BPM was itself skipped. Starting Tempo against files BPM never tagged would write a tempo marking derived from nothing and report the step as completed, which is why the dependant is refused instead.</w:t>
       </w:r>
     </w:p>
     <w:p>

</xml_diff>